<commit_message>
Add configurable shopping centre archive controls
</commit_message>
<xml_diff>
--- a/docs/Directorist-Shopping-Centres-User-Guide.docx
+++ b/docs/Directorist-Shopping-Centres-User-Guide.docx
@@ -486,13 +486,7 @@
         <w:ind w:left="0"/>
       </w:pPr>
       <w:r>
-        <w:rPr>
-          <w:rFonts w:ascii="Calibri" w:hAnsi="Calibri" w:eastAsia="Calibri"/>
-          <w:b/>
-          <w:color w:val="202938"/>
-          <w:sz w:val="22"/>
-        </w:rPr>
-        <w:t>2. Directorist &gt; Shopping Centres open koro</w:t>
+        <w:t>2. Listings &gt; All Shopping Centres open koro</w:t>
       </w:r>
     </w:p>
     <w:p>
@@ -500,13 +494,7 @@
         <w:ind w:left="360"/>
       </w:pPr>
       <w:r>
-        <w:rPr>
-          <w:rFonts w:ascii="Calibri" w:hAnsi="Calibri" w:eastAsia="Calibri"/>
-          <w:b w:val="0"/>
-          <w:color w:val="202938"/>
-          <w:sz w:val="21"/>
-        </w:rPr>
-        <w:t>Left sidebar theke Directorist menu-r niche Shopping Centres click koro.</w:t>
+        <w:t>Left sidebar theke Listings menu-r niche All Shopping Centres click koro.</w:t>
       </w:r>
     </w:p>
     <w:p>
@@ -528,13 +516,7 @@
         <w:ind w:left="360"/>
       </w:pPr>
       <w:r>
-        <w:rPr>
-          <w:rFonts w:ascii="Calibri" w:hAnsi="Calibri" w:eastAsia="Calibri"/>
-          <w:b w:val="0"/>
-          <w:color w:val="202938"/>
-          <w:sz w:val="21"/>
-        </w:rPr>
-        <w:t>Ei page e shortcode, Elementor widget info, and Sync Existing Listings button thakbe.</w:t>
+        <w:t>Listings &gt; Shopping Centre Tools open korle archive settings, import/sync tools, shortcode info, and frontend archive link pabe.</w:t>
       </w:r>
     </w:p>
     <w:p>
@@ -604,13 +586,7 @@
         <w:ind w:left="0"/>
       </w:pPr>
       <w:r>
-        <w:rPr>
-          <w:rFonts w:ascii="Calibri" w:hAnsi="Calibri" w:eastAsia="Calibri"/>
-          <w:b/>
-          <w:color w:val="202938"/>
-          <w:sz w:val="22"/>
-        </w:rPr>
-        <w:t>1. Directorist &gt; Shopping Centres e jao</w:t>
+        <w:t>1. Listings &gt; All Shopping Centres e jao</w:t>
       </w:r>
     </w:p>
     <w:p>
@@ -945,13 +921,7 @@
         <w:ind w:left="0"/>
       </w:pPr>
       <w:r>
-        <w:rPr>
-          <w:rFonts w:ascii="Calibri" w:hAnsi="Calibri" w:eastAsia="Calibri"/>
-          <w:b/>
-          <w:color w:val="202938"/>
-          <w:sz w:val="22"/>
-        </w:rPr>
-        <w:t>1. Directorist &gt; All Listings open koro</w:t>
+        <w:t>1. Listings &gt; All Listings open koro</w:t>
       </w:r>
     </w:p>
     <w:p>
@@ -1761,7 +1731,72 @@
         <w:pStyle w:val="Heading1"/>
       </w:pPr>
       <w:r>
-        <w:t>Step 7: Frontend Result Check Kora</w:t>
+        <w:t>Step 7: Complete Shopping Centres Archive Control Kora</w:t>
+      </w:r>
+    </w:p>
+    <w:p>
+      <w:pPr/>
+      <w:r>
+        <w:t>1. Listings &gt; Shopping Centre Tools open koro</w:t>
+      </w:r>
+    </w:p>
+    <w:p>
+      <w:pPr/>
+      <w:r>
+        <w:t>Archive display settings section theke complete /shopping-centres/ page control kora jay.</w:t>
+      </w:r>
+    </w:p>
+    <w:p>
+      <w:pPr/>
+      <w:r>
+        <w:t>2. Empty centre show ba hide choose koro</w:t>
+      </w:r>
+    </w:p>
+    <w:p>
+      <w:pPr/>
+      <w:r>
+        <w:t>Show option on thakle 0 current deals centre-o archive e thakbe. Off korle only current-deal centres show korbe.</w:t>
+      </w:r>
+    </w:p>
+    <w:p>
+      <w:pPr/>
+      <w:r>
+        <w:t>3. Archive options set koro</w:t>
+      </w:r>
+    </w:p>
+    <w:p>
+      <w:pPr/>
+      <w:r>
+        <w:t>6, 12, 24, ba All centres per page; search on/off; Name, Deal Count, ba Recently Added sorting; and deal-count display on/off choose kora jay.</w:t>
+      </w:r>
+    </w:p>
+    <w:p>
+      <w:pPr/>
+      <w:r>
+        <w:t>4. Save Archive Settings click koro</w:t>
+      </w:r>
+    </w:p>
+    <w:p>
+      <w:pPr/>
+      <w:r>
+        <w:t>Archive immediately update hobe. Homepage Elementor widget-er Hide Empty Centres and Limit settings unchanged thakbe.</w:t>
+      </w:r>
+    </w:p>
+    <w:p>
+      <w:pPr/>
+      <w:r>
+        <w:t>Important: kono individual centre-r Show this Shopping Centre publicly unchecked thakle archive setting on hole-o shei centre public hobe na.</w:t>
+      </w:r>
+    </w:p>
+    <w:p>
+      <w:pPr/>
+    </w:p>
+    <w:p>
+      <w:pPr>
+        <w:pStyle w:val="Heading1"/>
+      </w:pPr>
+      <w:r>
+        <w:t>Step 8: Frontend Result Check Kora</w:t>
       </w:r>
     </w:p>
     <w:p>
@@ -2589,6 +2624,14 @@
     </w:p>
     <w:p>
       <w:pPr>
+        <w:pStyle w:val="ListBullet"/>
+      </w:pPr>
+      <w:r>
+        <w:t>Archive display settings requirement onujayi save kora ache.</w:t>
+      </w:r>
+    </w:p>
+    <w:p>
+      <w:pPr>
         <w:pStyle w:val="Heading1"/>
       </w:pPr>
       <w:r>

</xml_diff>

<commit_message>
Translate Shopping Centres guide to English
</commit_message>
<xml_diff>
--- a/docs/Directorist-Shopping-Centres-User-Guide.docx
+++ b/docs/Directorist-Shopping-Centres-User-Guide.docx
@@ -37,6 +37,9 @@
         <w:gridCol w:w="9360"/>
       </w:tblGrid>
       <w:tr>
+        <w:trPr>
+          <w:cantSplit/>
+        </w:trPr>
         <w:tc>
           <w:tcPr>
             <w:tcW w:type="dxa" w:w="9360"/>
@@ -69,7 +72,7 @@
                 <w:color w:val="202938"/>
                 <w:sz w:val="21"/>
               </w:rPr>
-              <w:t>Ei extension diye shopping centre image tile show kora jay. Shopper tile click korle oi centre-r real Directorist deals show kore. Deal click korle normal Directorist single listing page open hoy.</w:t>
+              <w:t>This extension displays shopping centre image tiles. Selecting a tile opens real Directorist deals for that centre, and selecting a deal opens the normal Directorist single listing page.</w:t>
             </w:r>
           </w:p>
         </w:tc>
@@ -95,7 +98,7 @@
           <w:color w:val="202938"/>
           <w:sz w:val="21"/>
         </w:rPr>
-        <w:t>Shopping Centres name-e ekta new Directorist taxonomy add kore.</w:t>
+        <w:t>Adds a Shopping Centres taxonomy to Directorist listings.</w:t>
       </w:r>
     </w:p>
     <w:p>
@@ -109,7 +112,7 @@
           <w:color w:val="202938"/>
           <w:sz w:val="21"/>
         </w:rPr>
-        <w:t>Prottek shopping centre-r jonno image upload field add kore.</w:t>
+        <w:t>Adds an image upload field for every shopping centre.</w:t>
       </w:r>
     </w:p>
     <w:p>
@@ -123,7 +126,7 @@
           <w:color w:val="202938"/>
           <w:sz w:val="21"/>
         </w:rPr>
-        <w:t>Homepage/Page e Elementor widget diye centre tile show kore.</w:t>
+        <w:t>Displays shopping centre tiles through an Elementor widget.</w:t>
       </w:r>
     </w:p>
     <w:p>
@@ -137,7 +140,7 @@
           <w:color w:val="202938"/>
           <w:sz w:val="21"/>
         </w:rPr>
-        <w:t>Centre page e oi centre-r real Directorist listings/deals show kore.</w:t>
+        <w:t>Displays real Directorist listings and deals on each centre page.</w:t>
       </w:r>
     </w:p>
     <w:p>
@@ -151,7 +154,7 @@
           <w:color w:val="202938"/>
           <w:sz w:val="21"/>
         </w:rPr>
-        <w:t>Deal click korle existing Directorist single listing page e jay.</w:t>
+        <w:t>Opens the existing Directorist single listing page when a visitor selects a deal.</w:t>
       </w:r>
     </w:p>
     <w:tbl>
@@ -166,6 +169,9 @@
         <w:gridCol w:w="6120"/>
       </w:tblGrid>
       <w:tr>
+        <w:trPr>
+          <w:cantSplit/>
+        </w:trPr>
         <w:tc>
           <w:tcPr>
             <w:tcW w:type="dxa" w:w="4680"/>
@@ -214,6 +220,9 @@
         </w:tc>
       </w:tr>
       <w:tr>
+        <w:trPr>
+          <w:cantSplit/>
+        </w:trPr>
         <w:tc>
           <w:tcPr>
             <w:tcW w:type="dxa" w:w="3024"/>
@@ -260,6 +269,9 @@
         </w:tc>
       </w:tr>
       <w:tr>
+        <w:trPr>
+          <w:cantSplit/>
+        </w:trPr>
         <w:tc>
           <w:tcPr>
             <w:tcW w:type="dxa" w:w="3024"/>
@@ -306,6 +318,9 @@
         </w:tc>
       </w:tr>
       <w:tr>
+        <w:trPr>
+          <w:cantSplit/>
+        </w:trPr>
         <w:tc>
           <w:tcPr>
             <w:tcW w:type="dxa" w:w="3024"/>
@@ -346,12 +361,15 @@
                 <w:color w:val="202938"/>
                 <w:sz w:val="20"/>
               </w:rPr>
-              <w:t>Admin Media Library theke upload/select kora image</w:t>
+              <w:t>Image uploaded or selected from the WordPress Media Library</w:t>
             </w:r>
           </w:p>
         </w:tc>
       </w:tr>
       <w:tr>
+        <w:trPr>
+          <w:cantSplit/>
+        </w:trPr>
         <w:tc>
           <w:tcPr>
             <w:tcW w:type="dxa" w:w="3024"/>
@@ -392,12 +410,15 @@
                 <w:color w:val="202938"/>
                 <w:sz w:val="20"/>
               </w:rPr>
-              <w:t>Homepage e image + centre name + deal count</w:t>
+              <w:t>Homepage image, centre name, and deal count</w:t>
             </w:r>
           </w:p>
         </w:tc>
       </w:tr>
       <w:tr>
+        <w:trPr>
+          <w:cantSplit/>
+        </w:trPr>
         <w:tc>
           <w:tcPr>
             <w:tcW w:type="dxa" w:w="3024"/>
@@ -450,7 +471,7 @@
         <w:pStyle w:val="Heading1"/>
       </w:pPr>
       <w:r>
-        <w:t>Step 1: Plugin Page Kothay</w:t>
+        <w:t>Step 1: Find The Plugin Pages</w:t>
       </w:r>
     </w:p>
     <w:p>
@@ -464,7 +485,7 @@
           <w:color w:val="202938"/>
           <w:sz w:val="22"/>
         </w:rPr>
-        <w:t>1. WordPress Admin open koro</w:t>
+        <w:t>1. Open WordPress Admin</w:t>
       </w:r>
     </w:p>
     <w:p>
@@ -478,7 +499,7 @@
           <w:color w:val="202938"/>
           <w:sz w:val="21"/>
         </w:rPr>
-        <w:t>Browser e /wp-admin open kore login koro.</w:t>
+        <w:t>Open /wp-admin in your browser and sign in.</w:t>
       </w:r>
     </w:p>
     <w:p>
@@ -486,7 +507,7 @@
         <w:ind w:left="0"/>
       </w:pPr>
       <w:r>
-        <w:t>2. Listings &gt; All Shopping Centres open koro</w:t>
+        <w:t>2. Open Listings &gt; All Shopping Centres</w:t>
       </w:r>
     </w:p>
     <w:p>
@@ -494,7 +515,7 @@
         <w:ind w:left="360"/>
       </w:pPr>
       <w:r>
-        <w:t>Left sidebar theke Listings menu-r niche All Shopping Centres click koro.</w:t>
+        <w:t>In the left sidebar, open Listings, then select All Shopping Centres.</w:t>
       </w:r>
     </w:p>
     <w:p>
@@ -508,7 +529,7 @@
           <w:color w:val="202938"/>
           <w:sz w:val="22"/>
         </w:rPr>
-        <w:t>3. Plugin guide page dekho</w:t>
+        <w:t>3. Open The Extension Tools Page</w:t>
       </w:r>
     </w:p>
     <w:p>
@@ -516,7 +537,7 @@
         <w:ind w:left="360"/>
       </w:pPr>
       <w:r>
-        <w:t>Listings &gt; Shopping Centre Tools open korle archive settings, import/sync tools, shortcode info, and frontend archive link pabe.</w:t>
+        <w:t>Open Listings &gt; Shopping Centre Tools to access archive settings, import and sync tools, shortcode information, and the frontend archive link.</w:t>
       </w:r>
     </w:p>
     <w:p>
@@ -578,7 +599,7 @@
         <w:pStyle w:val="Heading1"/>
       </w:pPr>
       <w:r>
-        <w:t>Step 2: Shopping Centre Add/Edit Kora</w:t>
+        <w:t>Step 2: Add Or Edit A Shopping Centre</w:t>
       </w:r>
     </w:p>
     <w:p>
@@ -586,7 +607,7 @@
         <w:ind w:left="0"/>
       </w:pPr>
       <w:r>
-        <w:t>1. Listings &gt; All Shopping Centres e jao</w:t>
+        <w:t>1. Open Listings &gt; All Shopping Centres</w:t>
       </w:r>
     </w:p>
     <w:p>
@@ -600,7 +621,7 @@
           <w:color w:val="202938"/>
           <w:sz w:val="21"/>
         </w:rPr>
-        <w:t>Ei page e sob shopping centre list show korbe. Existing centre edit korte centre name-er upor hover kore Edit click koro.</w:t>
+        <w:t>This page lists all managed shopping centres. To update an existing centre, hover over its name and select Edit.</w:t>
       </w:r>
     </w:p>
     <w:p>
@@ -614,7 +635,7 @@
           <w:color w:val="202938"/>
           <w:sz w:val="22"/>
         </w:rPr>
-        <w:t>2. Name dao</w:t>
+        <w:t>2. Enter The Centre Name</w:t>
       </w:r>
     </w:p>
     <w:p>
@@ -628,7 +649,7 @@
           <w:color w:val="202938"/>
           <w:sz w:val="21"/>
         </w:rPr>
-        <w:t>Example: Westfield Bondi Junction. Slug blank rakha jay; WordPress auto create korbe.</w:t>
+        <w:t>Example: Westfield Bondi Junction. You can leave the slug empty and let WordPress create it automatically.</w:t>
       </w:r>
     </w:p>
     <w:p>
@@ -642,7 +663,7 @@
           <w:color w:val="202938"/>
           <w:sz w:val="22"/>
         </w:rPr>
-        <w:t>3. Description optional</w:t>
+        <w:t>3. Add An Optional Description</w:t>
       </w:r>
     </w:p>
     <w:p>
@@ -656,7 +677,7 @@
           <w:color w:val="202938"/>
           <w:sz w:val="21"/>
         </w:rPr>
-        <w:t>Description dile centre page e show hote pare. Na dile blank thakbe.</w:t>
+        <w:t>The description can appear on the centre page. Leave it empty if no description is required.</w:t>
       </w:r>
     </w:p>
     <w:p>
@@ -718,7 +739,7 @@
         <w:pStyle w:val="Heading1"/>
       </w:pPr>
       <w:r>
-        <w:t>Step 3: Shopping Centre Image Upload</w:t>
+        <w:t>Step 3: Upload A Shopping Centre Image</w:t>
       </w:r>
     </w:p>
     <w:p>
@@ -732,7 +753,7 @@
           <w:color w:val="202938"/>
           <w:sz w:val="22"/>
         </w:rPr>
-        <w:t>1. Edit Shopping Centre page e scroll koro</w:t>
+        <w:t>1. Open The Shopping Centre Edit Page</w:t>
       </w:r>
     </w:p>
     <w:p>
@@ -746,7 +767,7 @@
           <w:color w:val="202938"/>
           <w:sz w:val="21"/>
         </w:rPr>
-        <w:t>Nicher dike Shopping Centre Image field pabe.</w:t>
+        <w:t>Scroll down to the Shopping Centre Image field.</w:t>
       </w:r>
     </w:p>
     <w:p>
@@ -760,7 +781,7 @@
           <w:color w:val="202938"/>
           <w:sz w:val="22"/>
         </w:rPr>
-        <w:t>2. Select Image click koro</w:t>
+        <w:t>2. Select An Image</w:t>
       </w:r>
     </w:p>
     <w:p>
@@ -774,7 +795,7 @@
           <w:color w:val="202938"/>
           <w:sz w:val="21"/>
         </w:rPr>
-        <w:t>WordPress Media Library open hobe. Existing image select koro ba new image upload koro.</w:t>
+        <w:t>Click Select Image, then choose an existing image from the WordPress Media Library or upload a new one.</w:t>
       </w:r>
     </w:p>
     <w:p>
@@ -788,7 +809,7 @@
           <w:color w:val="202938"/>
           <w:sz w:val="22"/>
         </w:rPr>
-        <w:t>3. Update click koro</w:t>
+        <w:t>3. Update The Centre</w:t>
       </w:r>
     </w:p>
     <w:p>
@@ -802,7 +823,7 @@
           <w:color w:val="202938"/>
           <w:sz w:val="21"/>
         </w:rPr>
-        <w:t>Image save hole frontend tile and centre page e use hobe.</w:t>
+        <w:t>Click Update. The saved image will be used on frontend tiles and the centre page.</w:t>
       </w:r>
     </w:p>
     <w:tbl>
@@ -815,6 +836,9 @@
         <w:gridCol w:w="9360"/>
       </w:tblGrid>
       <w:tr>
+        <w:trPr>
+          <w:cantSplit/>
+        </w:trPr>
         <w:tc>
           <w:tcPr>
             <w:tcW w:type="dxa" w:w="9360"/>
@@ -847,7 +871,7 @@
                 <w:color w:val="202938"/>
                 <w:sz w:val="21"/>
               </w:rPr>
-              <w:t>Shopping centre tile-r jonno wide/landscape image best. Recommended minimum width: 1200px. Clear centre/building/photo use kora better.</w:t>
+              <w:t>Use a clear, wide landscape image of the centre or building. The recommended minimum width is 1200 pixels.</w:t>
             </w:r>
           </w:p>
         </w:tc>
@@ -913,7 +937,7 @@
         <w:pStyle w:val="Heading1"/>
       </w:pPr>
       <w:r>
-        <w:t>Step 4: Deal Listing ke Centre-r Sathe Connect Kora</w:t>
+        <w:t>Step 4: Assign A Deal Listing To A Centre</w:t>
       </w:r>
     </w:p>
     <w:p>
@@ -921,7 +945,7 @@
         <w:ind w:left="0"/>
       </w:pPr>
       <w:r>
-        <w:t>1. Listings &gt; All Listings open koro</w:t>
+        <w:t>1. Open Listings &gt; All Listings</w:t>
       </w:r>
     </w:p>
     <w:p>
@@ -935,7 +959,7 @@
           <w:color w:val="202938"/>
           <w:sz w:val="21"/>
         </w:rPr>
-        <w:t>Je deal listing centre page e show korte chao, sheta edit koro.</w:t>
+        <w:t>Edit the deal listing that should appear on the shopping centre page.</w:t>
       </w:r>
     </w:p>
     <w:p>
@@ -949,7 +973,7 @@
           <w:color w:val="202938"/>
           <w:sz w:val="22"/>
         </w:rPr>
-        <w:t>2. Right side e Shopping Centres box khujo</w:t>
+        <w:t>2. Find The Shopping Centres Panel</w:t>
       </w:r>
     </w:p>
     <w:p>
@@ -963,7 +987,7 @@
           <w:color w:val="202938"/>
           <w:sz w:val="21"/>
         </w:rPr>
-        <w:t>Centre name tick koro. Na thakle field-e centre name type kore Add click kora jay.</w:t>
+        <w:t>Select the correct centre. If it is missing, enter the centre name in the field and select Add.</w:t>
       </w:r>
     </w:p>
     <w:p>
@@ -977,7 +1001,7 @@
           <w:color w:val="202938"/>
           <w:sz w:val="22"/>
         </w:rPr>
-        <w:t>3. Update click koro</w:t>
+        <w:t>3. Update The Listing</w:t>
       </w:r>
     </w:p>
     <w:p>
@@ -991,7 +1015,7 @@
           <w:color w:val="202938"/>
           <w:sz w:val="21"/>
         </w:rPr>
-        <w:t>Listing save korar por oi shopping centre page e deal show korbe.</w:t>
+        <w:t>After the listing is saved, the deal will appear on the selected shopping centre page.</w:t>
       </w:r>
     </w:p>
     <w:p>
@@ -1053,7 +1077,7 @@
         <w:pStyle w:val="Heading1"/>
       </w:pPr>
       <w:r>
-        <w:t>Step 5: Homepage e Elementor Widget Add Kora</w:t>
+        <w:t>Step 5: Add The Elementor Widget To The Homepage</w:t>
       </w:r>
     </w:p>
     <w:p>
@@ -1067,7 +1091,7 @@
           <w:color w:val="202938"/>
           <w:sz w:val="22"/>
         </w:rPr>
-        <w:t>1. Homepage edit with Elementor</w:t>
+        <w:t>1. Edit The Homepage With Elementor</w:t>
       </w:r>
     </w:p>
     <w:p>
@@ -1081,7 +1105,7 @@
           <w:color w:val="202938"/>
           <w:sz w:val="21"/>
         </w:rPr>
-        <w:t>WordPress Pages theke homepage open kore Edit with Elementor click koro.</w:t>
+        <w:t>Open the homepage from Pages, then select Edit with Elementor.</w:t>
       </w:r>
     </w:p>
     <w:p>
@@ -1095,7 +1119,7 @@
           <w:color w:val="202938"/>
           <w:sz w:val="22"/>
         </w:rPr>
-        <w:t>2. Widget search koro</w:t>
+        <w:t>2. Find The Widget</w:t>
       </w:r>
     </w:p>
     <w:p>
@@ -1109,7 +1133,7 @@
           <w:color w:val="202938"/>
           <w:sz w:val="21"/>
         </w:rPr>
-        <w:t>Elementor left panel-er search box e Shopping Centres type koro.</w:t>
+        <w:t>Enter Shopping Centres in the Elementor widget search field.</w:t>
       </w:r>
     </w:p>
     <w:p>
@@ -1123,7 +1147,7 @@
           <w:color w:val="202938"/>
           <w:sz w:val="22"/>
         </w:rPr>
-        <w:t>3. Widget drag kore page e boshaw</w:t>
+        <w:t>3. Add The Widget</w:t>
       </w:r>
     </w:p>
     <w:p>
@@ -1137,7 +1161,7 @@
           <w:color w:val="202938"/>
           <w:sz w:val="21"/>
         </w:rPr>
-        <w:t>Je section e centre tiles show korte chao, sekhane widget drop koro.</w:t>
+        <w:t>Drag the widget into the section where the centre tiles should appear.</w:t>
       </w:r>
     </w:p>
     <w:p>
@@ -1199,7 +1223,7 @@
         <w:pStyle w:val="Heading1"/>
       </w:pPr>
       <w:r>
-        <w:t>Step 6: Elementor Theke Style Change Kora</w:t>
+        <w:t>Step 6: Style The Widget In Elementor</w:t>
       </w:r>
     </w:p>
     <w:tbl>
@@ -1212,6 +1236,9 @@
         <w:gridCol w:w="9360"/>
       </w:tblGrid>
       <w:tr>
+        <w:trPr>
+          <w:cantSplit/>
+        </w:trPr>
         <w:tc>
           <w:tcPr>
             <w:tcW w:type="dxa" w:w="9360"/>
@@ -1244,7 +1271,7 @@
                 <w:color w:val="202938"/>
                 <w:sz w:val="21"/>
               </w:rPr>
-              <w:t>Style update korar jonno CSS edit korte hobe na. Elementor widget select kore Content and Style tab use korlei hobe.</w:t>
+              <w:t>You do not need to edit CSS. Select the Elementor widget and use its Content and Style tabs.</w:t>
             </w:r>
           </w:p>
         </w:tc>
@@ -1263,6 +1290,9 @@
         <w:gridCol w:w="6120"/>
       </w:tblGrid>
       <w:tr>
+        <w:trPr>
+          <w:cantSplit/>
+        </w:trPr>
         <w:tc>
           <w:tcPr>
             <w:tcW w:type="dxa" w:w="4680"/>
@@ -1311,6 +1341,9 @@
         </w:tc>
       </w:tr>
       <w:tr>
+        <w:trPr>
+          <w:cantSplit/>
+        </w:trPr>
         <w:tc>
           <w:tcPr>
             <w:tcW w:type="dxa" w:w="3024"/>
@@ -1351,12 +1384,15 @@
                 <w:color w:val="202938"/>
                 <w:sz w:val="20"/>
               </w:rPr>
-              <w:t>Heading text change kora jay</w:t>
+              <w:t>Change the section heading text</w:t>
             </w:r>
           </w:p>
         </w:tc>
       </w:tr>
       <w:tr>
+        <w:trPr>
+          <w:cantSplit/>
+        </w:trPr>
         <w:tc>
           <w:tcPr>
             <w:tcW w:type="dxa" w:w="3024"/>
@@ -1397,12 +1433,15 @@
                 <w:color w:val="202938"/>
                 <w:sz w:val="20"/>
               </w:rPr>
-              <w:t>Desktop/tablet/mobile column count set kora jay</w:t>
+              <w:t>Set desktop, tablet, and mobile column counts</w:t>
             </w:r>
           </w:p>
         </w:tc>
       </w:tr>
       <w:tr>
+        <w:trPr>
+          <w:cantSplit/>
+        </w:trPr>
         <w:tc>
           <w:tcPr>
             <w:tcW w:type="dxa" w:w="3024"/>
@@ -1443,12 +1482,15 @@
                 <w:color w:val="202938"/>
                 <w:sz w:val="20"/>
               </w:rPr>
-              <w:t>Deal nai emon centre hide/show kora jay</w:t>
+              <w:t>Show or hide centres with no current deals</w:t>
             </w:r>
           </w:p>
         </w:tc>
       </w:tr>
       <w:tr>
+        <w:trPr>
+          <w:cantSplit/>
+        </w:trPr>
         <w:tc>
           <w:tcPr>
             <w:tcW w:type="dxa" w:w="3024"/>
@@ -1495,6 +1537,9 @@
         </w:tc>
       </w:tr>
       <w:tr>
+        <w:trPr>
+          <w:cantSplit/>
+        </w:trPr>
         <w:tc>
           <w:tcPr>
             <w:tcW w:type="dxa" w:w="3024"/>
@@ -1535,12 +1580,15 @@
                 <w:color w:val="202938"/>
                 <w:sz w:val="20"/>
               </w:rPr>
-              <w:t>Cards-er gap</w:t>
+              <w:t>Spacing between cards</w:t>
             </w:r>
           </w:p>
         </w:tc>
       </w:tr>
       <w:tr>
+        <w:trPr>
+          <w:cantSplit/>
+        </w:trPr>
         <w:tc>
           <w:tcPr>
             <w:tcW w:type="dxa" w:w="3024"/>
@@ -1587,6 +1635,9 @@
         </w:tc>
       </w:tr>
       <w:tr>
+        <w:trPr>
+          <w:cantSplit/>
+        </w:trPr>
         <w:tc>
           <w:tcPr>
             <w:tcW w:type="dxa" w:w="3024"/>
@@ -1633,6 +1684,9 @@
         </w:tc>
       </w:tr>
       <w:tr>
+        <w:trPr>
+          <w:cantSplit/>
+        </w:trPr>
         <w:tc>
           <w:tcPr>
             <w:tcW w:type="dxa" w:w="3024"/>
@@ -1679,6 +1733,9 @@
         </w:tc>
       </w:tr>
       <w:tr>
+        <w:trPr>
+          <w:cantSplit/>
+        </w:trPr>
         <w:tc>
           <w:tcPr>
             <w:tcW w:type="dxa" w:w="3024"/>
@@ -1731,61 +1788,61 @@
         <w:pStyle w:val="Heading1"/>
       </w:pPr>
       <w:r>
-        <w:t>Step 7: Complete Shopping Centres Archive Control Kora</w:t>
+        <w:t>Step 7: Configure The Complete Shopping Centres Archive</w:t>
       </w:r>
     </w:p>
     <w:p>
       <w:pPr/>
       <w:r>
-        <w:t>1. Listings &gt; Shopping Centre Tools open koro</w:t>
+        <w:t>1. Open Listings &gt; Shopping Centre Tools</w:t>
       </w:r>
     </w:p>
     <w:p>
       <w:pPr/>
       <w:r>
-        <w:t>Archive display settings section theke complete /shopping-centres/ page control kora jay.</w:t>
+        <w:t>Use Archive display settings to control the complete /shopping-centres/ page.</w:t>
       </w:r>
     </w:p>
     <w:p>
       <w:pPr/>
       <w:r>
-        <w:t>2. Empty centre show ba hide choose koro</w:t>
+        <w:t>2. Choose Whether To Show Empty Centres</w:t>
       </w:r>
     </w:p>
     <w:p>
       <w:pPr/>
       <w:r>
-        <w:t>Show option on thakle 0 current deals centre-o archive e thakbe. Off korle only current-deal centres show korbe.</w:t>
+        <w:t>When enabled, publicly visible centres with zero current deals remain in the archive. When disabled, only centres with current deals appear.</w:t>
       </w:r>
     </w:p>
     <w:p>
       <w:pPr/>
       <w:r>
-        <w:t>3. Archive options set koro</w:t>
+        <w:t>3. Configure Archive Options</w:t>
       </w:r>
     </w:p>
     <w:p>
       <w:pPr/>
       <w:r>
-        <w:t>6, 12, 24, ba All centres per page; search on/off; Name, Deal Count, ba Recently Added sorting; and deal-count display on/off choose kora jay.</w:t>
+        <w:t>Choose 6, 12, 24, or all centres per page; enable or disable search; sort by Name, Deal Count, or Recently Added; and show or hide deal counts.</w:t>
       </w:r>
     </w:p>
     <w:p>
       <w:pPr/>
       <w:r>
-        <w:t>4. Save Archive Settings click koro</w:t>
+        <w:t>4. Save Archive Settings</w:t>
       </w:r>
     </w:p>
     <w:p>
       <w:pPr/>
       <w:r>
-        <w:t>Archive immediately update hobe. Homepage Elementor widget-er Hide Empty Centres and Limit settings unchanged thakbe.</w:t>
+        <w:t>The archive updates immediately. The homepage Elementor widget's Hide Empty Centres and Limit settings remain unchanged.</w:t>
       </w:r>
     </w:p>
     <w:p>
       <w:pPr/>
       <w:r>
-        <w:t>Important: kono individual centre-r Show this Shopping Centre publicly unchecked thakle archive setting on hole-o shei centre public hobe na.</w:t>
+        <w:t>Important: a centre remains hidden if Show this Shopping Centre publicly is not selected, even when the archive is configured to show empty centres.</w:t>
       </w:r>
     </w:p>
     <w:p>
@@ -1796,7 +1853,7 @@
         <w:pStyle w:val="Heading1"/>
       </w:pPr>
       <w:r>
-        <w:t>Step 8: Frontend Result Check Kora</w:t>
+        <w:t>Step 8: Check The Frontend Result</w:t>
       </w:r>
     </w:p>
     <w:p>
@@ -1810,7 +1867,7 @@
           <w:color w:val="202938"/>
           <w:sz w:val="22"/>
         </w:rPr>
-        <w:t>1. Centre tile click koro</w:t>
+        <w:t>1. Open A Centre Tile</w:t>
       </w:r>
     </w:p>
     <w:p>
@@ -1824,7 +1881,7 @@
           <w:color w:val="202938"/>
           <w:sz w:val="21"/>
         </w:rPr>
-        <w:t>Homepage tile click korle automatic shopping centre page open hobe.</w:t>
+        <w:t>Selecting a homepage tile opens the corresponding shopping centre page.</w:t>
       </w:r>
     </w:p>
     <w:p>
@@ -1838,7 +1895,7 @@
           <w:color w:val="202938"/>
           <w:sz w:val="22"/>
         </w:rPr>
-        <w:t>2. Deal list check koro</w:t>
+        <w:t>2. Check The Deal List</w:t>
       </w:r>
     </w:p>
     <w:p>
@@ -1852,7 +1909,7 @@
           <w:color w:val="202938"/>
           <w:sz w:val="21"/>
         </w:rPr>
-        <w:t>Ei page e only oi centre-r participating store deals show korbe.</w:t>
+        <w:t>The page should display only participating-store deals assigned to that centre.</w:t>
       </w:r>
     </w:p>
     <w:p>
@@ -1866,7 +1923,7 @@
           <w:color w:val="202938"/>
           <w:sz w:val="22"/>
         </w:rPr>
-        <w:t>3. Deal click koro</w:t>
+        <w:t>3. Open A Deal</w:t>
       </w:r>
     </w:p>
     <w:p>
@@ -1880,7 +1937,7 @@
           <w:color w:val="202938"/>
           <w:sz w:val="21"/>
         </w:rPr>
-        <w:t>Deal click korle normal Directorist single listing page open hobe.</w:t>
+        <w:t>Selecting a deal opens the normal Directorist single listing page.</w:t>
       </w:r>
     </w:p>
     <w:p>
@@ -1969,7 +2026,7 @@
           <w:color w:val="202938"/>
           <w:sz w:val="21"/>
         </w:rPr>
-        <w:t>Elementor use na korle Shortcode widget/page content e ei shortcode paste kora jay.</w:t>
+        <w:t>If Elementor is not used, paste this shortcode into a Shortcode widget or the page content.</w:t>
       </w:r>
     </w:p>
     <w:tbl>
@@ -1984,6 +2041,9 @@
         <w:gridCol w:w="6120"/>
       </w:tblGrid>
       <w:tr>
+        <w:trPr>
+          <w:cantSplit/>
+        </w:trPr>
         <w:tc>
           <w:tcPr>
             <w:tcW w:type="dxa" w:w="4680"/>
@@ -2032,6 +2092,9 @@
         </w:tc>
       </w:tr>
       <w:tr>
+        <w:trPr>
+          <w:cantSplit/>
+        </w:trPr>
         <w:tc>
           <w:tcPr>
             <w:tcW w:type="dxa" w:w="3024"/>
@@ -2072,12 +2135,15 @@
                 <w:color w:val="202938"/>
                 <w:sz w:val="20"/>
               </w:rPr>
-              <w:t>Deal nai emon centre hide korbe</w:t>
+              <w:t>Hide centres with no current deals</w:t>
             </w:r>
           </w:p>
         </w:tc>
       </w:tr>
       <w:tr>
+        <w:trPr>
+          <w:cantSplit/>
+        </w:trPr>
         <w:tc>
           <w:tcPr>
             <w:tcW w:type="dxa" w:w="3024"/>
@@ -2118,12 +2184,15 @@
                 <w:color w:val="202938"/>
                 <w:sz w:val="20"/>
               </w:rPr>
-              <w:t>Sob centre show korbe</w:t>
+              <w:t>Show all publicly visible centres</w:t>
             </w:r>
           </w:p>
         </w:tc>
       </w:tr>
       <w:tr>
+        <w:trPr>
+          <w:cantSplit/>
+        </w:trPr>
         <w:tc>
           <w:tcPr>
             <w:tcW w:type="dxa" w:w="3024"/>
@@ -2170,6 +2239,9 @@
         </w:tc>
       </w:tr>
       <w:tr>
+        <w:trPr>
+          <w:cantSplit/>
+        </w:trPr>
         <w:tc>
           <w:tcPr>
             <w:tcW w:type="dxa" w:w="3024"/>
@@ -2210,7 +2282,7 @@
                 <w:color w:val="202938"/>
                 <w:sz w:val="20"/>
               </w:rPr>
-              <w:t>Maximum 6 centre show korbe</w:t>
+              <w:t>Display a maximum of six centres</w:t>
             </w:r>
           </w:p>
         </w:tc>
@@ -2237,6 +2309,9 @@
         <w:gridCol w:w="6120"/>
       </w:tblGrid>
       <w:tr>
+        <w:trPr>
+          <w:cantSplit/>
+        </w:trPr>
         <w:tc>
           <w:tcPr>
             <w:tcW w:type="dxa" w:w="4680"/>
@@ -2285,6 +2360,9 @@
         </w:tc>
       </w:tr>
       <w:tr>
+        <w:trPr>
+          <w:cantSplit/>
+        </w:trPr>
         <w:tc>
           <w:tcPr>
             <w:tcW w:type="dxa" w:w="3024"/>
@@ -2303,7 +2381,7 @@
                 <w:color w:val="202938"/>
                 <w:sz w:val="20"/>
               </w:rPr>
-              <w:t>Centre tile show hocche na</w:t>
+              <w:t>Centre tile is not visible</w:t>
             </w:r>
           </w:p>
         </w:tc>
@@ -2325,12 +2403,15 @@
                 <w:color w:val="202938"/>
                 <w:sz w:val="20"/>
               </w:rPr>
-              <w:t>Check koro centre create kora ache and widget hide_empty setting off/on correct ache.</w:t>
+              <w:t>Confirm that the centre exists and that the widget's hide_empty setting is correct.</w:t>
             </w:r>
           </w:p>
         </w:tc>
       </w:tr>
       <w:tr>
+        <w:trPr>
+          <w:cantSplit/>
+        </w:trPr>
         <w:tc>
           <w:tcPr>
             <w:tcW w:type="dxa" w:w="3024"/>
@@ -2349,7 +2430,7 @@
                 <w:color w:val="202938"/>
                 <w:sz w:val="20"/>
               </w:rPr>
-              <w:t>Deal show hocche na</w:t>
+              <w:t>Deal is not visible</w:t>
             </w:r>
           </w:p>
         </w:tc>
@@ -2371,12 +2452,15 @@
                 <w:color w:val="202938"/>
                 <w:sz w:val="20"/>
               </w:rPr>
-              <w:t>Listing edit kore right side Shopping Centres box-e centre assign koro.</w:t>
+              <w:t>Edit the listing and assign the centre in the Shopping Centres panel.</w:t>
             </w:r>
           </w:p>
         </w:tc>
       </w:tr>
       <w:tr>
+        <w:trPr>
+          <w:cantSplit/>
+        </w:trPr>
         <w:tc>
           <w:tcPr>
             <w:tcW w:type="dxa" w:w="3024"/>
@@ -2395,7 +2479,7 @@
                 <w:color w:val="202938"/>
                 <w:sz w:val="20"/>
               </w:rPr>
-              <w:t>Image show hocche na</w:t>
+              <w:t>Image is not visible</w:t>
             </w:r>
           </w:p>
         </w:tc>
@@ -2417,12 +2501,15 @@
                 <w:color w:val="202938"/>
                 <w:sz w:val="20"/>
               </w:rPr>
-              <w:t>Shopping Centre edit page e Select Image kore Update click koro.</w:t>
+              <w:t>Edit the centre, select an image, and click Update.</w:t>
             </w:r>
           </w:p>
         </w:tc>
       </w:tr>
       <w:tr>
+        <w:trPr>
+          <w:cantSplit/>
+        </w:trPr>
         <w:tc>
           <w:tcPr>
             <w:tcW w:type="dxa" w:w="3024"/>
@@ -2463,12 +2550,15 @@
                 <w:color w:val="202938"/>
                 <w:sz w:val="20"/>
               </w:rPr>
-              <w:t>Settings &gt; Permalinks e giye Save Changes click koro.</w:t>
+              <w:t>Open Settings &gt; Permalinks and click Save Changes.</w:t>
             </w:r>
           </w:p>
         </w:tc>
       </w:tr>
       <w:tr>
+        <w:trPr>
+          <w:cantSplit/>
+        </w:trPr>
         <w:tc>
           <w:tcPr>
             <w:tcW w:type="dxa" w:w="3024"/>
@@ -2487,7 +2577,7 @@
                 <w:color w:val="202938"/>
                 <w:sz w:val="20"/>
               </w:rPr>
-              <w:t>Wrong/fake centre name</w:t>
+              <w:t>Incorrect centre name</w:t>
             </w:r>
           </w:p>
         </w:tc>
@@ -2509,7 +2599,7 @@
                 <w:color w:val="202938"/>
                 <w:sz w:val="20"/>
               </w:rPr>
-              <w:t>Directorist &gt; Shopping Centres theke wrong centre delete/rename koro.</w:t>
+              <w:t>Rename or delete the incorrect centre from Directorist &gt; Shopping Centres.</w:t>
             </w:r>
           </w:p>
         </w:tc>
@@ -2535,7 +2625,7 @@
           <w:color w:val="202938"/>
           <w:sz w:val="21"/>
         </w:rPr>
-        <w:t>Plugin active ache.</w:t>
+        <w:t>The extension is active.</w:t>
       </w:r>
     </w:p>
     <w:p>
@@ -2549,7 +2639,7 @@
           <w:color w:val="202938"/>
           <w:sz w:val="21"/>
         </w:rPr>
-        <w:t>Shopping centre create kora ache.</w:t>
+        <w:t>The shopping centre has been created.</w:t>
       </w:r>
     </w:p>
     <w:p>
@@ -2563,7 +2653,7 @@
           <w:color w:val="202938"/>
           <w:sz w:val="21"/>
         </w:rPr>
-        <w:t>Shopping centre image upload kora ache.</w:t>
+        <w:t>A shopping centre image has been uploaded.</w:t>
       </w:r>
     </w:p>
     <w:p>
@@ -2577,7 +2667,7 @@
           <w:color w:val="202938"/>
           <w:sz w:val="21"/>
         </w:rPr>
-        <w:t>Deal listings correct centre-r sathe assigned.</w:t>
+        <w:t>Deal listings are assigned to the correct centre.</w:t>
       </w:r>
     </w:p>
     <w:p>
@@ -2591,7 +2681,7 @@
           <w:color w:val="202938"/>
           <w:sz w:val="21"/>
         </w:rPr>
-        <w:t>Elementor widget homepage e add kora ache.</w:t>
+        <w:t>The Elementor widget has been added to the homepage.</w:t>
       </w:r>
     </w:p>
     <w:p>
@@ -2605,7 +2695,7 @@
           <w:color w:val="202938"/>
           <w:sz w:val="21"/>
         </w:rPr>
-        <w:t>Frontend tile click kore centre page check kora hoyeche.</w:t>
+        <w:t>The frontend centre tile and centre page have been checked.</w:t>
       </w:r>
     </w:p>
     <w:p>
@@ -2619,7 +2709,7 @@
           <w:color w:val="202938"/>
           <w:sz w:val="21"/>
         </w:rPr>
-        <w:t>Deal click kore Directorist listing page check kora hoyeche.</w:t>
+        <w:t>The Directorist listing page has been checked from a deal link.</w:t>
       </w:r>
     </w:p>
     <w:p>
@@ -2627,7 +2717,7 @@
         <w:pStyle w:val="ListBullet"/>
       </w:pPr>
       <w:r>
-        <w:t>Archive display settings requirement onujayi save kora ache.</w:t>
+        <w:t>Archive display settings have been saved according to the site requirements.</w:t>
       </w:r>
     </w:p>
     <w:p>
@@ -2650,6 +2740,9 @@
         <w:gridCol w:w="6120"/>
       </w:tblGrid>
       <w:tr>
+        <w:trPr>
+          <w:cantSplit/>
+        </w:trPr>
         <w:tc>
           <w:tcPr>
             <w:tcW w:type="dxa" w:w="4680"/>
@@ -2698,6 +2791,9 @@
         </w:tc>
       </w:tr>
       <w:tr>
+        <w:trPr>
+          <w:cantSplit/>
+        </w:trPr>
         <w:tc>
           <w:tcPr>
             <w:tcW w:type="dxa" w:w="3024"/>
@@ -2744,6 +2840,9 @@
         </w:tc>
       </w:tr>
       <w:tr>
+        <w:trPr>
+          <w:cantSplit/>
+        </w:trPr>
         <w:tc>
           <w:tcPr>
             <w:tcW w:type="dxa" w:w="3024"/>
@@ -2790,6 +2889,9 @@
         </w:tc>
       </w:tr>
       <w:tr>
+        <w:trPr>
+          <w:cantSplit/>
+        </w:trPr>
         <w:tc>
           <w:tcPr>
             <w:tcW w:type="dxa" w:w="3024"/>
@@ -2836,6 +2938,9 @@
         </w:tc>
       </w:tr>
       <w:tr>
+        <w:trPr>
+          <w:cantSplit/>
+        </w:trPr>
         <w:tc>
           <w:tcPr>
             <w:tcW w:type="dxa" w:w="3024"/>
@@ -2882,6 +2987,9 @@
         </w:tc>
       </w:tr>
       <w:tr>
+        <w:trPr>
+          <w:cantSplit/>
+        </w:trPr>
         <w:tc>
           <w:tcPr>
             <w:tcW w:type="dxa" w:w="3024"/>
@@ -2928,6 +3036,9 @@
         </w:tc>
       </w:tr>
       <w:tr>
+        <w:trPr>
+          <w:cantSplit/>
+        </w:trPr>
         <w:tc>
           <w:tcPr>
             <w:tcW w:type="dxa" w:w="3024"/>
@@ -2974,6 +3085,9 @@
         </w:tc>
       </w:tr>
       <w:tr>
+        <w:trPr>
+          <w:cantSplit/>
+        </w:trPr>
         <w:tc>
           <w:tcPr>
             <w:tcW w:type="dxa" w:w="3024"/>

</xml_diff>